<commit_message>
Configure Docker Hub CI and fix watchlist IDs
</commit_message>
<xml_diff>
--- a/docs/v2/StreamFlix-v2-Architecture-and-Deployment.docx
+++ b/docs/v2/StreamFlix-v2-Architecture-and-Deployment.docx
@@ -4671,7 +4671,7 @@
     </w:p>
     <w:p>
       <w:r>
-        <w:t>Active workflows now live in .github/workflows. Actions are pinned to verified commit SHAs, with the source version retained in comments. Pull-request validation has read-only permissions. Image publication uses GHCR and the built-in token scoped to packages; attestation jobs use OIDC. Repository owner and release SHA are derived from the workflow context, not personal hardcoded registry paths.</w:t>
+        <w:t>Active workflows now live in .github/workflows. Actions are pinned to verified commit SHAs, with the source version retained in comments. Pull-request validation has read-only permissions. Image publication uses Docker Hub with repository Actions secrets DOCKERHUB_USERNAME and DOCKERHUB_TOKEN. The namespace is derived from that username and the release SHA from the workflow context. BuildKit attaches SBOM and provenance metadata. The built-in GITHUB_TOKEN is used separately to propose the digest promotion PR; enable repository permission for Actions to create pull requests. The first source push publishes images; deployment is triggered separately after promotion and runner setup.</w:t>
       </w:r>
     </w:p>
     <w:p>
@@ -4902,7 +4902,7 @@
         <w:br/>
         <w:t>- GitHub Actions references: resolved to immutable commit SHAs using the upstream tag references.</w:t>
         <w:br/>
-        <w:t>- Isolated real-service integration harness: prepared and attempted. Docker Desktop could not pull postgres:16-alpine because registry-1.docker.io timed out; service integration did not run locally. It is an explicit CI gate.</w:t>
+        <w:t>- Isolated real-service integration harness: passed against temporary real Postgres and Redis instances. Verified migrations, hashed passwords, authenticated gateway proxying, secure cookies, user ownership, persisted watchlist/progress, numeric title IDs and invalid-ID rejection, idempotent sandbox billing, CSRF and logout. The earlier image-pull blocker is resolved. This remains an explicit CI gate.</w:t>
         <w:br/>
         <w:t>- Application image builds/scans, actual GitHub CI run, application rollout/live smoke, application DB TLS, production mTLS, Argo CD sync, load testing, backup restore and secret rotation remain unverified. Platform rollout, cross-node NetworkPolicy enforcement and Grafana HTTPS trust passed the checks above.</w:t>
         <w:br/>
@@ -4956,7 +4956,7 @@
     </w:p>
     <w:p>
       <w:r>
-        <w:t>GitHub artifact attestations: https://docs.github.com/en/actions/concepts/security/artifact-attestations</w:t>
+        <w:t>Docker BuildKit attestations in GitHub Actions: https://docs.docker.com/build/ci/github-actions/attestations/</w:t>
       </w:r>
     </w:p>
     <w:p>

</xml_diff>